<commit_message>
feat: atualização completa do projeto - dossie, fisconforme, frontend e testes
</commit_message>
<xml_diff>
--- a/modelo/Relatorio_Final_Fisconforme_n_atendido.docx
+++ b/modelo/Relatorio_Final_Fisconforme_n_atendido.docx
@@ -775,8 +775,9 @@
     </w:p>
     <w:p>
       <w:pPr>
-        <w:spacing w:after="120" w:line="283" w:lineRule="auto"/>
-        <w:jc w:val="both"/>
+        <w:rPr>
+          <w:lang w:val="pt-BR"/>
+        </w:rPr>
       </w:pPr>
       <w:r>
         <w:t>{{</w:t>
@@ -788,6 +789,90 @@
       <w:proofErr w:type="spellEnd"/>
       <w:r>
         <w:t>}}</w:t>
+      </w:r>
+      <w:r>
+        <w:t xml:space="preserve"> {{{</w:t>
+      </w:r>
+      <w:r>
+        <w:t>(</w:t>
+      </w:r>
+      <w:proofErr w:type="spellStart"/>
+      <w:r>
+        <w:t>Descrever</w:t>
+      </w:r>
+      <w:proofErr w:type="spellEnd"/>
+      <w:r>
+        <w:t xml:space="preserve"> </w:t>
+      </w:r>
+      <w:proofErr w:type="spellStart"/>
+      <w:r>
+        <w:t>objetivamente</w:t>
+      </w:r>
+      <w:proofErr w:type="spellEnd"/>
+      <w:r>
+        <w:t xml:space="preserve"> a </w:t>
+      </w:r>
+      <w:proofErr w:type="spellStart"/>
+      <w:r>
+        <w:t>situação</w:t>
+      </w:r>
+      <w:proofErr w:type="spellEnd"/>
+      <w:r>
+        <w:t xml:space="preserve"> </w:t>
+      </w:r>
+      <w:proofErr w:type="spellStart"/>
+      <w:r>
+        <w:t>verificada</w:t>
+      </w:r>
+      <w:proofErr w:type="spellEnd"/>
+      <w:r>
+        <w:t xml:space="preserve"> e </w:t>
+      </w:r>
+      <w:proofErr w:type="spellStart"/>
+      <w:r>
+        <w:t>os</w:t>
+      </w:r>
+      <w:proofErr w:type="spellEnd"/>
+      <w:r>
+        <w:t xml:space="preserve"> </w:t>
+      </w:r>
+      <w:proofErr w:type="spellStart"/>
+      <w:r>
+        <w:t>fatos</w:t>
+      </w:r>
+      <w:proofErr w:type="spellEnd"/>
+      <w:r>
+        <w:t xml:space="preserve"> </w:t>
+      </w:r>
+      <w:proofErr w:type="spellStart"/>
+      <w:r>
+        <w:t>relevantes</w:t>
+      </w:r>
+      <w:proofErr w:type="spellEnd"/>
+      <w:r>
+        <w:t xml:space="preserve"> para a </w:t>
+      </w:r>
+      <w:proofErr w:type="spellStart"/>
+      <w:r>
+        <w:t>conclusão</w:t>
+      </w:r>
+      <w:proofErr w:type="spellEnd"/>
+      <w:r>
+        <w:t xml:space="preserve"> da </w:t>
+      </w:r>
+      <w:proofErr w:type="spellStart"/>
+      <w:r>
+        <w:t>ação</w:t>
+      </w:r>
+      <w:proofErr w:type="spellEnd"/>
+      <w:r>
+        <w:t>.)</w:t>
+      </w:r>
+      <w:r>
+        <w:rPr>
+          <w:lang w:val="pt-BR"/>
+        </w:rPr>
+        <w:t>}}}</w:t>
       </w:r>
     </w:p>
     <w:p>
@@ -819,7 +904,179 @@
         <w:jc w:val="both"/>
       </w:pPr>
       <w:r>
-        <w:t>A análise observou os princípios de uniformidade procedimental e vedação a contestação parcial das pendências. Foram examinadas as justificativas apresentadas e confrontadas com os dados fiscais disponíveis, tendo sido adotadas as seguintes decisões:</w:t>
+        <w:t xml:space="preserve">A análise observou os princípios de uniformidade procedimental e vedação a contestação parcial das pendências. Foram examinadas as justificativas apresentadas e confrontadas com os dados fiscais disponíveis, tendo sido </w:t>
+      </w:r>
+      <w:proofErr w:type="spellStart"/>
+      <w:r>
+        <w:t>adotadas</w:t>
+      </w:r>
+      <w:proofErr w:type="spellEnd"/>
+      <w:r>
+        <w:t xml:space="preserve"> as </w:t>
+      </w:r>
+      <w:proofErr w:type="spellStart"/>
+      <w:r>
+        <w:t>seguintes</w:t>
+      </w:r>
+      <w:proofErr w:type="spellEnd"/>
+      <w:r>
+        <w:t xml:space="preserve"> </w:t>
+      </w:r>
+      <w:proofErr w:type="spellStart"/>
+      <w:r>
+        <w:t>decisões</w:t>
+      </w:r>
+      <w:proofErr w:type="spellEnd"/>
+      <w:r>
+        <w:t>:</w:t>
+      </w:r>
+    </w:p>
+    <w:p>
+      <w:pPr>
+        <w:jc w:val="both"/>
+        <w:rPr>
+          <w:lang w:val="pt-BR"/>
+        </w:rPr>
+      </w:pPr>
+      <w:r>
+        <w:t>{{{</w:t>
+      </w:r>
+      <w:r>
+        <w:t>(</w:t>
+      </w:r>
+      <w:proofErr w:type="spellStart"/>
+      <w:r>
+        <w:t>Descrever</w:t>
+      </w:r>
+      <w:proofErr w:type="spellEnd"/>
+      <w:r>
+        <w:t xml:space="preserve">, de forma </w:t>
+      </w:r>
+      <w:proofErr w:type="spellStart"/>
+      <w:r>
+        <w:t>resumida</w:t>
+      </w:r>
+      <w:proofErr w:type="spellEnd"/>
+      <w:r>
+        <w:t xml:space="preserve"> e </w:t>
+      </w:r>
+      <w:proofErr w:type="spellStart"/>
+      <w:r>
+        <w:t>fundamentada</w:t>
+      </w:r>
+      <w:proofErr w:type="spellEnd"/>
+      <w:r>
+        <w:t xml:space="preserve">, </w:t>
+      </w:r>
+      <w:proofErr w:type="spellStart"/>
+      <w:r>
+        <w:t>os</w:t>
+      </w:r>
+      <w:proofErr w:type="spellEnd"/>
+      <w:r>
+        <w:t xml:space="preserve"> </w:t>
+      </w:r>
+      <w:proofErr w:type="spellStart"/>
+      <w:r>
+        <w:t>deferimentos</w:t>
+      </w:r>
+      <w:proofErr w:type="spellEnd"/>
+      <w:r>
+        <w:t xml:space="preserve">, </w:t>
+      </w:r>
+      <w:proofErr w:type="spellStart"/>
+      <w:r>
+        <w:t>indeferimentos</w:t>
+      </w:r>
+      <w:proofErr w:type="spellEnd"/>
+      <w:r>
+        <w:t xml:space="preserve">, </w:t>
+      </w:r>
+      <w:proofErr w:type="spellStart"/>
+      <w:r>
+        <w:t>orientações</w:t>
+      </w:r>
+      <w:proofErr w:type="spellEnd"/>
+      <w:r>
+        <w:t xml:space="preserve"> </w:t>
+      </w:r>
+      <w:proofErr w:type="spellStart"/>
+      <w:r>
+        <w:t>prestadas</w:t>
+      </w:r>
+      <w:proofErr w:type="spellEnd"/>
+      <w:r>
+        <w:t xml:space="preserve"> </w:t>
+      </w:r>
+      <w:proofErr w:type="spellStart"/>
+      <w:r>
+        <w:t>ao</w:t>
+      </w:r>
+      <w:proofErr w:type="spellEnd"/>
+      <w:r>
+        <w:t xml:space="preserve"> </w:t>
+      </w:r>
+      <w:proofErr w:type="spellStart"/>
+      <w:r>
+        <w:t>contribuinte</w:t>
+      </w:r>
+      <w:proofErr w:type="spellEnd"/>
+      <w:r>
+        <w:t xml:space="preserve">, </w:t>
+      </w:r>
+      <w:proofErr w:type="spellStart"/>
+      <w:r>
+        <w:t>registros</w:t>
+      </w:r>
+      <w:proofErr w:type="spellEnd"/>
+      <w:r>
+        <w:t xml:space="preserve"> </w:t>
+      </w:r>
+      <w:proofErr w:type="spellStart"/>
+      <w:r>
+        <w:t>efetuados</w:t>
+      </w:r>
+      <w:proofErr w:type="spellEnd"/>
+      <w:r>
+        <w:t xml:space="preserve"> no </w:t>
+      </w:r>
+      <w:proofErr w:type="spellStart"/>
+      <w:r>
+        <w:t>Sismonitora</w:t>
+      </w:r>
+      <w:proofErr w:type="spellEnd"/>
+      <w:r>
+        <w:t xml:space="preserve"> e </w:t>
+      </w:r>
+      <w:proofErr w:type="spellStart"/>
+      <w:r>
+        <w:t>demais</w:t>
+      </w:r>
+      <w:proofErr w:type="spellEnd"/>
+      <w:r>
+        <w:t xml:space="preserve"> </w:t>
+      </w:r>
+      <w:proofErr w:type="spellStart"/>
+      <w:r>
+        <w:t>encaminhamentos</w:t>
+      </w:r>
+      <w:proofErr w:type="spellEnd"/>
+      <w:r>
+        <w:t xml:space="preserve"> </w:t>
+      </w:r>
+      <w:proofErr w:type="spellStart"/>
+      <w:r>
+        <w:t>adotados</w:t>
+      </w:r>
+      <w:proofErr w:type="spellEnd"/>
+      <w:r>
+        <w:t>.)</w:t>
+      </w:r>
+      <w:r>
+        <w:rPr>
+          <w:lang w:val="pt-BR"/>
+        </w:rPr>
+        <w:t>}}}</w:t>
       </w:r>
     </w:p>
     <w:tbl>
@@ -914,7 +1171,163 @@
         <w:jc w:val="both"/>
       </w:pPr>
       <w:r>
-        <w:t>Após a conclusão da ação fiscal, as pendências apresentaram os seguintes desfechos:</w:t>
+        <w:t xml:space="preserve">Após a conclusão da ação fiscal, as pendências </w:t>
+      </w:r>
+      <w:proofErr w:type="spellStart"/>
+      <w:r>
+        <w:t>apresentaram</w:t>
+      </w:r>
+      <w:proofErr w:type="spellEnd"/>
+      <w:r>
+        <w:t xml:space="preserve"> </w:t>
+      </w:r>
+      <w:proofErr w:type="spellStart"/>
+      <w:r>
+        <w:t>os</w:t>
+      </w:r>
+      <w:proofErr w:type="spellEnd"/>
+      <w:r>
+        <w:t xml:space="preserve"> </w:t>
+      </w:r>
+      <w:proofErr w:type="spellStart"/>
+      <w:r>
+        <w:t>seguintes</w:t>
+      </w:r>
+      <w:proofErr w:type="spellEnd"/>
+      <w:r>
+        <w:t xml:space="preserve"> </w:t>
+      </w:r>
+      <w:proofErr w:type="spellStart"/>
+      <w:r>
+        <w:t>desfechos</w:t>
+      </w:r>
+      <w:proofErr w:type="spellEnd"/>
+      <w:r>
+        <w:t>:</w:t>
+      </w:r>
+    </w:p>
+    <w:p>
+      <w:pPr>
+        <w:jc w:val="both"/>
+        <w:rPr>
+          <w:lang w:val="pt-BR"/>
+        </w:rPr>
+      </w:pPr>
+      <w:r>
+        <w:t>{{{</w:t>
+      </w:r>
+      <w:r>
+        <w:t>(</w:t>
+      </w:r>
+      <w:proofErr w:type="spellStart"/>
+      <w:r>
+        <w:t>Anexar</w:t>
+      </w:r>
+      <w:proofErr w:type="spellEnd"/>
+      <w:r>
+        <w:t xml:space="preserve"> </w:t>
+      </w:r>
+      <w:proofErr w:type="spellStart"/>
+      <w:r>
+        <w:t>relatório</w:t>
+      </w:r>
+      <w:proofErr w:type="spellEnd"/>
+      <w:r>
+        <w:t xml:space="preserve"> </w:t>
+      </w:r>
+      <w:proofErr w:type="spellStart"/>
+      <w:r>
+        <w:t>extraído</w:t>
+      </w:r>
+      <w:proofErr w:type="spellEnd"/>
+      <w:r>
+        <w:t xml:space="preserve"> do </w:t>
+      </w:r>
+      <w:proofErr w:type="spellStart"/>
+      <w:r>
+        <w:t>Sismonitora</w:t>
+      </w:r>
+      <w:proofErr w:type="spellEnd"/>
+      <w:r>
+        <w:t xml:space="preserve"> com </w:t>
+      </w:r>
+      <w:proofErr w:type="gramStart"/>
+      <w:r>
+        <w:t>a</w:t>
+      </w:r>
+      <w:proofErr w:type="gramEnd"/>
+      <w:r>
+        <w:t xml:space="preserve"> </w:t>
+      </w:r>
+      <w:proofErr w:type="spellStart"/>
+      <w:r>
+        <w:t>atualização</w:t>
+      </w:r>
+      <w:proofErr w:type="spellEnd"/>
+      <w:r>
+        <w:t xml:space="preserve"> final das </w:t>
+      </w:r>
+      <w:proofErr w:type="spellStart"/>
+      <w:r>
+        <w:t>pendências</w:t>
+      </w:r>
+      <w:proofErr w:type="spellEnd"/>
+      <w:r>
+        <w:t xml:space="preserve"> e, </w:t>
+      </w:r>
+      <w:proofErr w:type="spellStart"/>
+      <w:r>
+        <w:t>quando</w:t>
+      </w:r>
+      <w:proofErr w:type="spellEnd"/>
+      <w:r>
+        <w:t xml:space="preserve"> </w:t>
+      </w:r>
+      <w:proofErr w:type="spellStart"/>
+      <w:r>
+        <w:t>houver</w:t>
+      </w:r>
+      <w:proofErr w:type="spellEnd"/>
+      <w:r>
+        <w:t xml:space="preserve">, </w:t>
+      </w:r>
+      <w:proofErr w:type="spellStart"/>
+      <w:r>
+        <w:t>os</w:t>
+      </w:r>
+      <w:proofErr w:type="spellEnd"/>
+      <w:r>
+        <w:t xml:space="preserve"> </w:t>
+      </w:r>
+      <w:proofErr w:type="spellStart"/>
+      <w:r>
+        <w:t>registros</w:t>
+      </w:r>
+      <w:proofErr w:type="spellEnd"/>
+      <w:r>
+        <w:t xml:space="preserve"> de </w:t>
+      </w:r>
+      <w:proofErr w:type="spellStart"/>
+      <w:r>
+        <w:t>recomendação</w:t>
+      </w:r>
+      <w:proofErr w:type="spellEnd"/>
+      <w:r>
+        <w:t xml:space="preserve"> de </w:t>
+      </w:r>
+      <w:proofErr w:type="spellStart"/>
+      <w:r>
+        <w:t>ações</w:t>
+      </w:r>
+      <w:proofErr w:type="spellEnd"/>
+      <w:r>
+        <w:t>.)</w:t>
+      </w:r>
+      <w:r>
+        <w:rPr>
+          <w:lang w:val="pt-BR"/>
+        </w:rPr>
+        <w:t>}}}</w:t>
       </w:r>
     </w:p>
     <w:tbl>
@@ -1118,13 +1531,7 @@
         <w:rPr>
           <w:color w:val="444444"/>
         </w:rPr>
-        <w:t>{{CARGO}}</w:t>
-      </w:r>
-      <w:r>
-        <w:rPr>
-          <w:color w:val="444444"/>
-        </w:rPr>
-        <w:t xml:space="preserve"> Fiscal de </w:t>
+        <w:t xml:space="preserve">{{CARGO}} Fiscal de </w:t>
       </w:r>
       <w:proofErr w:type="spellStart"/>
       <w:r>
@@ -1138,8 +1545,16 @@
         <w:rPr>
           <w:color w:val="444444"/>
         </w:rPr>
-        <w:t xml:space="preserve"> Estaduais</w:t>
-      </w:r>
+        <w:t xml:space="preserve"> </w:t>
+      </w:r>
+      <w:proofErr w:type="spellStart"/>
+      <w:r>
+        <w:rPr>
+          <w:color w:val="444444"/>
+        </w:rPr>
+        <w:t>Estaduais</w:t>
+      </w:r>
+      <w:proofErr w:type="spellEnd"/>
     </w:p>
     <w:p>
       <w:pPr>
@@ -1349,22 +1764,24 @@
         <w:noProof/>
       </w:rPr>
       <w:drawing>
-        <wp:inline distT="0" distB="0" distL="0" distR="0" wp14:anchorId="4B644E31" wp14:editId="62188D08">
-          <wp:extent cx="5184000" cy="861593"/>
-          <wp:effectExtent l="0" t="0" r="0" b="0"/>
-          <wp:docPr id="427787699" name="Picture 1"/>
+        <wp:inline distT="0" distB="0" distL="0" distR="0" wp14:anchorId="3378719A" wp14:editId="2EAAF577">
+          <wp:extent cx="2657475" cy="544195"/>
+          <wp:effectExtent l="0" t="0" r="9525" b="8255"/>
+          <wp:docPr id="1834378980" name="Image 1"/>
           <wp:cNvGraphicFramePr>
-            <a:graphicFrameLocks xmlns:a="http://schemas.openxmlformats.org/drawingml/2006/main" noChangeAspect="1"/>
+            <a:graphicFrameLocks xmlns:a="http://schemas.openxmlformats.org/drawingml/2006/main"/>
           </wp:cNvGraphicFramePr>
           <a:graphic xmlns:a="http://schemas.openxmlformats.org/drawingml/2006/main">
             <a:graphicData uri="http://schemas.openxmlformats.org/drawingml/2006/picture">
               <pic:pic xmlns:pic="http://schemas.openxmlformats.org/drawingml/2006/picture">
                 <pic:nvPicPr>
-                  <pic:cNvPr id="0" name="image0.jpg"/>
-                  <pic:cNvPicPr/>
+                  <pic:cNvPr id="1" name="Image 1"/>
+                  <pic:cNvPicPr>
+                    <a:picLocks/>
+                  </pic:cNvPicPr>
                 </pic:nvPicPr>
                 <pic:blipFill>
-                  <a:blip r:embed="rId1"/>
+                  <a:blip r:embed="rId1" cstate="print"/>
                   <a:stretch>
                     <a:fillRect/>
                   </a:stretch>
@@ -1372,7 +1789,7 @@
                 <pic:spPr>
                   <a:xfrm>
                     <a:off x="0" y="0"/>
-                    <a:ext cx="5184000" cy="861593"/>
+                    <a:ext cx="2657475" cy="544195"/>
                   </a:xfrm>
                   <a:prstGeom prst="rect">
                     <a:avLst/>

</xml_diff>